<commit_message>
all working reasonably well
</commit_message>
<xml_diff>
--- a/UCRC Website Guide.docx
+++ b/UCRC Website Guide.docx
@@ -919,6 +919,116 @@
     </w:p>
     <w:p>
       <w:pPr>
+        <w:spacing w:before="280" w:after="80"/>
+      </w:pPr>
+      <w:r>
+        <w:rPr>
+          <w:rFonts w:ascii="Arial Narrow" w:hAnsi="Arial Narrow"/>
+          <w:b/>
+          <w:i w:val="0"/>
+          <w:color w:val="1A1A1A"/>
+          <w:sz w:val="26"/>
+        </w:rPr>
+        <w:t xml:space="preserve">Contact page — Exec team</w:t>
+      </w:r>
+    </w:p>
+    <w:p>
+      <w:pPr>
+        <w:spacing w:after="120"/>
+      </w:pPr>
+      <w:r>
+        <w:rPr>
+          <w:rFonts w:ascii="Arial" w:hAnsi="Arial"/>
+          <w:b w:val="0"/>
+          <w:i w:val="0"/>
+          <w:color w:val="555555"/>
+          <w:sz w:val="22"/>
+        </w:rPr>
+        <w:t xml:space="preserve">Add, edit, remove, and reorder the exec team member cards shown on the Contact page. Upload and crop photos directly from your computer.</w:t>
+      </w:r>
+    </w:p>
+    <w:p>
+      <w:pPr>
+        <w:pStyle w:val="ListBullet"/>
+        <w:spacing w:after="60"/>
+      </w:pPr>
+      <w:r>
+        <w:rPr>
+          <w:rFonts w:ascii="Arial" w:hAnsi="Arial"/>
+          <w:b w:val="0"/>
+          <w:i w:val="0"/>
+          <w:color w:val="555555"/>
+          <w:sz w:val="22"/>
+        </w:rPr>
+        <w:t xml:space="preserve">Go to the Contact page and click ✎ Edit page (visible to admins only).</w:t>
+      </w:r>
+    </w:p>
+    <w:p>
+      <w:pPr>
+        <w:pStyle w:val="ListBullet"/>
+        <w:spacing w:after="60"/>
+      </w:pPr>
+      <w:r>
+        <w:rPr>
+          <w:rFonts w:ascii="Arial" w:hAnsi="Arial"/>
+          <w:b w:val="0"/>
+          <w:i w:val="0"/>
+          <w:color w:val="555555"/>
+          <w:sz w:val="22"/>
+        </w:rPr>
+        <w:t xml:space="preserve">Click ✎ on any card to edit that person's name, role, or photo.</w:t>
+      </w:r>
+    </w:p>
+    <w:p>
+      <w:pPr>
+        <w:pStyle w:val="ListBullet"/>
+        <w:spacing w:after="60"/>
+      </w:pPr>
+      <w:r>
+        <w:rPr>
+          <w:rFonts w:ascii="Arial" w:hAnsi="Arial"/>
+          <w:b w:val="0"/>
+          <w:i w:val="0"/>
+          <w:color w:val="555555"/>
+          <w:sz w:val="22"/>
+        </w:rPr>
+        <w:t xml:space="preserve">Click ＋ Add member to add a new person — enter their name and role, then upload a photo. Use the crop tool to drag and zoom the photo to frame the shot.</w:t>
+      </w:r>
+    </w:p>
+    <w:p>
+      <w:pPr>
+        <w:pStyle w:val="ListBullet"/>
+        <w:spacing w:after="60"/>
+      </w:pPr>
+      <w:r>
+        <w:rPr>
+          <w:rFonts w:ascii="Arial" w:hAnsi="Arial"/>
+          <w:b w:val="0"/>
+          <w:i w:val="0"/>
+          <w:color w:val="555555"/>
+          <w:sz w:val="22"/>
+        </w:rPr>
+        <w:t xml:space="preserve">Use ↑ ↓ to reorder cards, or × to remove a member (with confirmation).</w:t>
+      </w:r>
+    </w:p>
+    <w:p>
+      <w:pPr>
+        <w:pStyle w:val="ListBullet"/>
+        <w:spacing w:after="60"/>
+      </w:pPr>
+      <w:r>
+        <w:rPr>
+          <w:rFonts w:ascii="Arial" w:hAnsi="Arial"/>
+          <w:b w:val="0"/>
+          <w:i w:val="0"/>
+          <w:color w:val="555555"/>
+          <w:sz w:val="22"/>
+        </w:rPr>
+        <w:t xml:space="preserve">Changes save immediately to the database.</w:t>
+      </w:r>
+    </w:p>
+    <w:p>
+      <w:pPr>
         <w:spacing w:before="440" w:after="120"/>
         <w:pBdr>
           <w:bottom w:val="single" w:sz="6" w:space="4" w:color="E8A020"/>
@@ -977,7 +1087,37 @@
           <w:color w:val="555555"/>
           <w:sz w:val="22"/>
         </w:rPr>
-        <w:t>Members click Members Login in the navigation bar, then Sign up. They fill in their name, email, phone, year of study, and a password. Their account is then visible in the Admin panel.</w:t>
+        <w:t>Members click Members Login in the navigation bar, then Sign up. They fill in their name, email, phone number, student ID, year of study, and choose a password. Once signed up they can access their Fees page and the Forms page.</w:t>
+      </w:r>
+    </w:p>
+    <w:p>
+      <w:pPr>
+        <w:spacing w:before="280" w:after="80"/>
+      </w:pPr>
+      <w:r>
+        <w:rPr>
+          <w:rFonts w:ascii="Arial Narrow" w:hAnsi="Arial Narrow"/>
+          <w:b/>
+          <w:i w:val="0"/>
+          <w:color w:val="1A1A1A"/>
+          <w:sz w:val="26"/>
+        </w:rPr>
+        <w:t xml:space="preserve">My Fees page</w:t>
+      </w:r>
+    </w:p>
+    <w:p>
+      <w:pPr>
+        <w:spacing w:after="120"/>
+      </w:pPr>
+      <w:r>
+        <w:rPr>
+          <w:rFonts w:ascii="Arial" w:hAnsi="Arial"/>
+          <w:b w:val="0"/>
+          <w:i w:val="0"/>
+          <w:color w:val="555555"/>
+          <w:sz w:val="22"/>
+        </w:rPr>
+        <w:t xml:space="preserve">Once logged in, members can go to Fees in the navigation bar to see all their fees. Outstanding fees show a "Pay now" button. Completed payments appear in a payment history list at the bottom of the page. Members can pay online directly through the website using Blink Pay (see Online Payments section below).</w:t>
       </w:r>
     </w:p>
     <w:p>
@@ -1023,7 +1163,7 @@
           <w:color w:val="555555"/>
           <w:sz w:val="22"/>
         </w:rPr>
-        <w:t>View all member accounts</w:t>
+        <w:t>View all members — toggle the Active filter to show/hide inactive members</w:t>
       </w:r>
     </w:p>
     <w:p>
@@ -1039,7 +1179,7 @@
           <w:color w:val="555555"/>
           <w:sz w:val="22"/>
         </w:rPr>
-        <w:t>Edit member details (name, phone, year of study)</w:t>
+        <w:t>Edit member details (name, phone, student ID, year of study, active status)</w:t>
       </w:r>
     </w:p>
     <w:p>
@@ -1055,7 +1195,7 @@
           <w:color w:val="555555"/>
           <w:sz w:val="22"/>
         </w:rPr>
-        <w:t>Delete accounts</w:t>
+        <w:t>Delete accounts — payment records are preserved even after deletion</w:t>
       </w:r>
     </w:p>
     <w:p>
@@ -1071,7 +1211,7 @@
           <w:color w:val="555555"/>
           <w:sz w:val="22"/>
         </w:rPr>
-        <w:t>Grant or remove admin status</w:t>
+        <w:t>Grant or remove admin status (requires confirmation)</w:t>
       </w:r>
     </w:p>
     <w:p>
@@ -1087,7 +1227,7 @@
           <w:color w:val="555555"/>
           <w:sz w:val="22"/>
         </w:rPr>
-        <w:t>Assign fees to members and mark them as paid</w:t>
+        <w:t>Create fee types and assign fees to members — supports custom amounts per person</w:t>
       </w:r>
     </w:p>
     <w:p>
@@ -1103,7 +1243,610 @@
           <w:color w:val="555555"/>
           <w:sz w:val="22"/>
         </w:rPr>
-        <w:t>Track which forms each member has completed</w:t>
+        <w:t>Mark fees as paid, filter and export to CSV, and archive completed fee rounds</w:t>
+      </w:r>
+    </w:p>
+    <w:p>
+      <w:pPr>
+        <w:pStyle w:val="ListBullet"/>
+        <w:spacing w:after="60"/>
+      </w:pPr>
+      <w:r>
+        <w:rPr>
+          <w:rFonts w:ascii="Arial" w:hAnsi="Arial"/>
+          <w:b w:val="0"/>
+          <w:i w:val="0"/>
+          <w:color w:val="555555"/>
+          <w:sz w:val="22"/>
+        </w:rPr>
+        <w:t xml:space="preserve">Track which forms each member has completed</w:t>
+      </w:r>
+    </w:p>
+    <w:p>
+      <w:pPr>
+        <w:spacing w:before="280" w:after="80"/>
+      </w:pPr>
+      <w:r>
+        <w:rPr>
+          <w:rFonts w:ascii="Arial Narrow" w:hAnsi="Arial Narrow"/>
+          <w:b/>
+          <w:i w:val="0"/>
+          <w:color w:val="1A1A1A"/>
+          <w:sz w:val="26"/>
+        </w:rPr>
+        <w:t xml:space="preserve">The admin panel — in detail</w:t>
+      </w:r>
+    </w:p>
+    <w:p>
+      <w:pPr>
+        <w:spacing w:after="120"/>
+      </w:pPr>
+      <w:r>
+        <w:rPr>
+          <w:rFonts w:ascii="Arial" w:hAnsi="Arial"/>
+          <w:b w:val="0"/>
+          <w:i w:val="0"/>
+          <w:color w:val="555555"/>
+          <w:sz w:val="22"/>
+        </w:rPr>
+        <w:t xml:space="preserve">The Admin panel has four tabs: Members, Fees, Forms, and Add Member. Here is what each one does.</w:t>
+      </w:r>
+    </w:p>
+    <w:p>
+      <w:pPr>
+        <w:spacing w:before="280" w:after="80"/>
+      </w:pPr>
+      <w:r>
+        <w:rPr>
+          <w:rFonts w:ascii="Arial Narrow" w:hAnsi="Arial Narrow"/>
+          <w:b/>
+          <w:i w:val="0"/>
+          <w:color w:val="1A1A1A"/>
+          <w:sz w:val="26"/>
+        </w:rPr>
+        <w:t xml:space="preserve">Members tab</w:t>
+      </w:r>
+    </w:p>
+    <w:p>
+      <w:pPr>
+        <w:spacing w:after="120"/>
+      </w:pPr>
+      <w:r>
+        <w:rPr>
+          <w:rFonts w:ascii="Arial" w:hAnsi="Arial"/>
+          <w:b w:val="0"/>
+          <w:i w:val="0"/>
+          <w:color w:val="555555"/>
+          <w:sz w:val="22"/>
+        </w:rPr>
+        <w:t xml:space="preserve">Shows a table of every registered member. Each row displays their name, email, student ID, year of study, and their active and admin status.</w:t>
+      </w:r>
+    </w:p>
+    <w:p>
+      <w:pPr>
+        <w:pStyle w:val="ListBullet"/>
+        <w:spacing w:after="60"/>
+      </w:pPr>
+      <w:r>
+        <w:rPr>
+          <w:rFonts w:ascii="Arial" w:hAnsi="Arial"/>
+          <w:b w:val="0"/>
+          <w:i w:val="0"/>
+          <w:color w:val="555555"/>
+          <w:sz w:val="22"/>
+        </w:rPr>
+        <w:t xml:space="preserve">Use the "Show active only" button at the top to hide inactive members from the list. This is useful once the roster is large.</w:t>
+      </w:r>
+    </w:p>
+    <w:p>
+      <w:pPr>
+        <w:pStyle w:val="ListBullet"/>
+        <w:spacing w:after="60"/>
+      </w:pPr>
+      <w:r>
+        <w:rPr>
+          <w:rFonts w:ascii="Arial" w:hAnsi="Arial"/>
+          <w:b w:val="0"/>
+          <w:i w:val="0"/>
+          <w:color w:val="555555"/>
+          <w:sz w:val="22"/>
+        </w:rPr>
+        <w:t xml:space="preserve">Click ⋮ (three dots) next to any member to edit their details or delete their account.</w:t>
+      </w:r>
+    </w:p>
+    <w:p>
+      <w:pPr>
+        <w:pStyle w:val="ListBullet"/>
+        <w:spacing w:after="60"/>
+      </w:pPr>
+      <w:r>
+        <w:rPr>
+          <w:rFonts w:ascii="Arial" w:hAnsi="Arial"/>
+          <w:b w:val="0"/>
+          <w:i w:val="0"/>
+          <w:color w:val="555555"/>
+          <w:sz w:val="22"/>
+        </w:rPr>
+        <w:t xml:space="preserve">Editing a member lets you update their name, phone number, student ID, year of study, active status, and admin status.</w:t>
+      </w:r>
+    </w:p>
+    <w:p>
+      <w:pPr>
+        <w:pStyle w:val="ListBullet"/>
+        <w:spacing w:after="60"/>
+      </w:pPr>
+      <w:r>
+        <w:rPr>
+          <w:rFonts w:ascii="Arial" w:hAnsi="Arial"/>
+          <w:b w:val="0"/>
+          <w:i w:val="0"/>
+          <w:color w:val="555555"/>
+          <w:sz w:val="22"/>
+        </w:rPr>
+        <w:t xml:space="preserve">To mark a member as inactive (e.g. they have left the club), untick the Active box in their edit form. Inactive members are hidden from fee assignment so you don't accidentally assign fees to people who are no longer in the club.</w:t>
+      </w:r>
+    </w:p>
+    <w:p>
+      <w:pPr>
+        <w:pStyle w:val="ListBullet"/>
+        <w:spacing w:after="60"/>
+      </w:pPr>
+      <w:r>
+        <w:rPr>
+          <w:rFonts w:ascii="Arial" w:hAnsi="Arial"/>
+          <w:b w:val="0"/>
+          <w:i w:val="0"/>
+          <w:color w:val="555555"/>
+          <w:sz w:val="22"/>
+        </w:rPr>
+        <w:t xml:space="preserve">Deleting a member removes their account and any unpaid fees, but all payment records are kept permanently so the financial history is never lost.</w:t>
+      </w:r>
+    </w:p>
+    <w:p>
+      <w:pPr>
+        <w:pStyle w:val="ListBullet"/>
+        <w:spacing w:after="60"/>
+      </w:pPr>
+      <w:r>
+        <w:rPr>
+          <w:rFonts w:ascii="Arial" w:hAnsi="Arial"/>
+          <w:b w:val="0"/>
+          <w:i w:val="0"/>
+          <w:color w:val="555555"/>
+          <w:sz w:val="22"/>
+        </w:rPr>
+        <w:t xml:space="preserve">Toggling someone's admin status on or off requires confirmation to prevent accidental changes.</w:t>
+      </w:r>
+    </w:p>
+    <w:p>
+      <w:pPr>
+        <w:spacing w:before="280" w:after="80"/>
+      </w:pPr>
+      <w:r>
+        <w:rPr>
+          <w:rFonts w:ascii="Arial Narrow" w:hAnsi="Arial Narrow"/>
+          <w:b/>
+          <w:i w:val="0"/>
+          <w:color w:val="1A1A1A"/>
+          <w:sz w:val="26"/>
+        </w:rPr>
+        <w:t xml:space="preserve">Fees tab</w:t>
+      </w:r>
+    </w:p>
+    <w:p>
+      <w:pPr>
+        <w:spacing w:after="120"/>
+      </w:pPr>
+      <w:r>
+        <w:rPr>
+          <w:rFonts w:ascii="Arial" w:hAnsi="Arial"/>
+          <w:b w:val="0"/>
+          <w:i w:val="0"/>
+          <w:color w:val="555555"/>
+          <w:sz w:val="22"/>
+        </w:rPr>
+        <w:t xml:space="preserve">The Fees tab has four sub-tabs: Fee Types, Unpaid, Paid, and Archive. Together they handle the full life cycle of a fee — from creation, through payment, to permanent record.</w:t>
+      </w:r>
+    </w:p>
+    <w:p>
+      <w:pPr>
+        <w:spacing w:before="280" w:after="80"/>
+      </w:pPr>
+      <w:r>
+        <w:rPr>
+          <w:rFonts w:ascii="Arial Narrow" w:hAnsi="Arial Narrow"/>
+          <w:b/>
+          <w:i w:val="0"/>
+          <w:color w:val="1A1A1A"/>
+          <w:sz w:val="26"/>
+        </w:rPr>
+        <w:t xml:space="preserve">Fee Types sub-tab</w:t>
+      </w:r>
+    </w:p>
+    <w:p>
+      <w:pPr>
+        <w:spacing w:after="120"/>
+      </w:pPr>
+      <w:r>
+        <w:rPr>
+          <w:rFonts w:ascii="Arial" w:hAnsi="Arial"/>
+          <w:b w:val="0"/>
+          <w:i w:val="0"/>
+          <w:color w:val="555555"/>
+          <w:sz w:val="22"/>
+        </w:rPr>
+        <w:t xml:space="preserve">This is where you create and manage reusable fee templates. Each fee type has a name, description, amount, and an optional due date. There are two special settings:</w:t>
+      </w:r>
+    </w:p>
+    <w:p>
+      <w:pPr>
+        <w:pStyle w:val="ListBullet"/>
+        <w:spacing w:after="60"/>
+      </w:pPr>
+      <w:r>
+        <w:rPr>
+          <w:rFonts w:ascii="Arial" w:hAnsi="Arial"/>
+          <w:b w:val="0"/>
+          <w:i w:val="0"/>
+          <w:color w:val="555555"/>
+          <w:sz w:val="22"/>
+        </w:rPr>
+        <w:t xml:space="preserve">"Assigned to all" — the fee appears on all members' fees pages automatically without needing to assign it to each person individually. Useful for things like annual membership fees that everyone pays.</w:t>
+      </w:r>
+    </w:p>
+    <w:p>
+      <w:pPr>
+        <w:pStyle w:val="ListBullet"/>
+        <w:spacing w:after="60"/>
+      </w:pPr>
+      <w:r>
+        <w:rPr>
+          <w:rFonts w:ascii="Arial" w:hAnsi="Arial"/>
+          <w:b w:val="0"/>
+          <w:i w:val="0"/>
+          <w:color w:val="555555"/>
+          <w:sz w:val="22"/>
+        </w:rPr>
+        <w:t xml:space="preserve">"Custom amounts" — allows you to enter a different amount per member when you assign the fee. Useful when costs vary (e.g. regatta entries that depend on how many events each person enters).</w:t>
+      </w:r>
+    </w:p>
+    <w:p>
+      <w:pPr>
+        <w:spacing w:after="120"/>
+      </w:pPr>
+      <w:r>
+        <w:rPr>
+          <w:rFonts w:ascii="Arial" w:hAnsi="Arial"/>
+          <w:b w:val="0"/>
+          <w:i w:val="0"/>
+          <w:color w:val="555555"/>
+          <w:sz w:val="22"/>
+        </w:rPr>
+        <w:t xml:space="preserve">To create a fee type: click + Add fee type, fill in the details, and click Save. To delete a fee type: click the × on its row in the list. Deleting a fee type does not remove any fees already assigned to members.</w:t>
+      </w:r>
+    </w:p>
+    <w:p>
+      <w:pPr>
+        <w:spacing w:before="280" w:after="80"/>
+      </w:pPr>
+      <w:r>
+        <w:rPr>
+          <w:rFonts w:ascii="Arial Narrow" w:hAnsi="Arial Narrow"/>
+          <w:b/>
+          <w:i w:val="0"/>
+          <w:color w:val="1A1A1A"/>
+          <w:sz w:val="26"/>
+        </w:rPr>
+        <w:t xml:space="preserve">Assigning fees to members</w:t>
+      </w:r>
+    </w:p>
+    <w:p>
+      <w:pPr>
+        <w:spacing w:after="120"/>
+      </w:pPr>
+      <w:r>
+        <w:rPr>
+          <w:rFonts w:ascii="Arial" w:hAnsi="Arial"/>
+          <w:b w:val="0"/>
+          <w:i w:val="0"/>
+          <w:color w:val="555555"/>
+          <w:sz w:val="22"/>
+        </w:rPr>
+        <w:t xml:space="preserve">Click "Assign fee" to assign a fee type to specific members. Select the fee type from the dropdown, then tick which members should receive it (inactive members are hidden). If the fee type has custom amounts enabled, a dollar amount field appears next to each member's name — enter their individual amount. Click Assign to create the fee records. Members will see the fee on their Fees page straight away.</w:t>
+      </w:r>
+    </w:p>
+    <w:p>
+      <w:pPr>
+        <w:spacing w:before="280" w:after="80"/>
+      </w:pPr>
+      <w:r>
+        <w:rPr>
+          <w:rFonts w:ascii="Arial Narrow" w:hAnsi="Arial Narrow"/>
+          <w:b/>
+          <w:i w:val="0"/>
+          <w:color w:val="1A1A1A"/>
+          <w:sz w:val="26"/>
+        </w:rPr>
+        <w:t xml:space="preserve">Unpaid sub-tab</w:t>
+      </w:r>
+    </w:p>
+    <w:p>
+      <w:pPr>
+        <w:spacing w:after="120"/>
+      </w:pPr>
+      <w:r>
+        <w:rPr>
+          <w:rFonts w:ascii="Arial" w:hAnsi="Arial"/>
+          <w:b w:val="0"/>
+          <w:i w:val="0"/>
+          <w:color w:val="555555"/>
+          <w:sz w:val="22"/>
+        </w:rPr>
+        <w:t xml:space="preserve">Shows all fees that have not yet been paid. Use this to track what's outstanding across the whole squad.</w:t>
+      </w:r>
+    </w:p>
+    <w:p>
+      <w:pPr>
+        <w:pStyle w:val="ListBullet"/>
+        <w:spacing w:after="60"/>
+      </w:pPr>
+      <w:r>
+        <w:rPr>
+          <w:rFonts w:ascii="Arial" w:hAnsi="Arial"/>
+          <w:b w:val="0"/>
+          <w:i w:val="0"/>
+          <w:color w:val="555555"/>
+          <w:sz w:val="22"/>
+        </w:rPr>
+        <w:t xml:space="preserve">Filter by fee type using the dropdown to see only one type of fee at a time.</w:t>
+      </w:r>
+    </w:p>
+    <w:p>
+      <w:pPr>
+        <w:pStyle w:val="ListBullet"/>
+        <w:spacing w:after="60"/>
+      </w:pPr>
+      <w:r>
+        <w:rPr>
+          <w:rFonts w:ascii="Arial" w:hAnsi="Arial"/>
+          <w:b w:val="0"/>
+          <w:i w:val="0"/>
+          <w:color w:val="555555"/>
+          <w:sz w:val="22"/>
+        </w:rPr>
+        <w:t xml:space="preserve">Search by member name using the text box on the left.</w:t>
+      </w:r>
+    </w:p>
+    <w:p>
+      <w:pPr>
+        <w:pStyle w:val="ListBullet"/>
+        <w:spacing w:after="60"/>
+      </w:pPr>
+      <w:r>
+        <w:rPr>
+          <w:rFonts w:ascii="Arial" w:hAnsi="Arial"/>
+          <w:b w:val="0"/>
+          <w:i w:val="0"/>
+          <w:color w:val="555555"/>
+          <w:sz w:val="22"/>
+        </w:rPr>
+        <w:t xml:space="preserve">Click "Mark paid" on any row to manually record a payment (e.g. for cash payments). You will be asked to confirm before it is marked.</w:t>
+      </w:r>
+    </w:p>
+    <w:p>
+      <w:pPr>
+        <w:pStyle w:val="ListBullet"/>
+        <w:spacing w:after="60"/>
+      </w:pPr>
+      <w:r>
+        <w:rPr>
+          <w:rFonts w:ascii="Arial" w:hAnsi="Arial"/>
+          <w:b w:val="0"/>
+          <w:i w:val="0"/>
+          <w:color w:val="555555"/>
+          <w:sz w:val="22"/>
+        </w:rPr>
+        <w:t xml:space="preserve">Click "Export CSV" to download a spreadsheet of everyone currently showing as unpaid — useful for chasing up payments.</w:t>
+      </w:r>
+    </w:p>
+    <w:p>
+      <w:pPr>
+        <w:spacing w:before="280" w:after="80"/>
+      </w:pPr>
+      <w:r>
+        <w:rPr>
+          <w:rFonts w:ascii="Arial Narrow" w:hAnsi="Arial Narrow"/>
+          <w:b/>
+          <w:i w:val="0"/>
+          <w:color w:val="1A1A1A"/>
+          <w:sz w:val="26"/>
+        </w:rPr>
+        <w:t xml:space="preserve">Paid sub-tab</w:t>
+      </w:r>
+    </w:p>
+    <w:p>
+      <w:pPr>
+        <w:spacing w:after="120"/>
+      </w:pPr>
+      <w:r>
+        <w:rPr>
+          <w:rFonts w:ascii="Arial" w:hAnsi="Arial"/>
+          <w:b w:val="0"/>
+          <w:i w:val="0"/>
+          <w:color w:val="555555"/>
+          <w:sz w:val="22"/>
+        </w:rPr>
+        <w:t xml:space="preserve">Shows all fees that have been paid. Fees paid online via Blink Pay are labelled accordingly. Fees marked manually show no label.</w:t>
+      </w:r>
+    </w:p>
+    <w:p>
+      <w:pPr>
+        <w:pStyle w:val="ListBullet"/>
+        <w:spacing w:after="60"/>
+      </w:pPr>
+      <w:r>
+        <w:rPr>
+          <w:rFonts w:ascii="Arial" w:hAnsi="Arial"/>
+          <w:b w:val="0"/>
+          <w:i w:val="0"/>
+          <w:color w:val="555555"/>
+          <w:sz w:val="22"/>
+        </w:rPr>
+        <w:t xml:space="preserve">Filter by fee type, search by member name, or filter by date range (e.g. to see everyone who paid in a specific week).</w:t>
+      </w:r>
+    </w:p>
+    <w:p>
+      <w:pPr>
+        <w:pStyle w:val="ListBullet"/>
+        <w:spacing w:after="60"/>
+      </w:pPr>
+      <w:r>
+        <w:rPr>
+          <w:rFonts w:ascii="Arial" w:hAnsi="Arial"/>
+          <w:b w:val="0"/>
+          <w:i w:val="0"/>
+          <w:color w:val="555555"/>
+          <w:sz w:val="22"/>
+        </w:rPr>
+        <w:t xml:space="preserve">Click "Export CSV" to download a spreadsheet of the current paid list.</w:t>
+      </w:r>
+    </w:p>
+    <w:p>
+      <w:pPr>
+        <w:pStyle w:val="ListBullet"/>
+        <w:spacing w:after="60"/>
+      </w:pPr>
+      <w:r>
+        <w:rPr>
+          <w:rFonts w:ascii="Arial" w:hAnsi="Arial"/>
+          <w:b w:val="0"/>
+          <w:i w:val="0"/>
+          <w:color w:val="555555"/>
+          <w:sz w:val="22"/>
+        </w:rPr>
+        <w:t xml:space="preserve">Once a fee round is complete (e.g. everyone who is going to pay has paid), click "Archive fee" to move it to the archive. Select the fee name from the dropdown and confirm.</w:t>
+      </w:r>
+    </w:p>
+    <w:p>
+      <w:pPr>
+        <w:spacing w:before="280" w:after="80"/>
+      </w:pPr>
+      <w:r>
+        <w:rPr>
+          <w:rFonts w:ascii="Arial Narrow" w:hAnsi="Arial Narrow"/>
+          <w:b/>
+          <w:i w:val="0"/>
+          <w:color w:val="1A1A1A"/>
+          <w:sz w:val="26"/>
+        </w:rPr>
+        <w:t xml:space="preserve">Archive sub-tab</w:t>
+      </w:r>
+    </w:p>
+    <w:p>
+      <w:pPr>
+        <w:spacing w:after="120"/>
+      </w:pPr>
+      <w:r>
+        <w:rPr>
+          <w:rFonts w:ascii="Arial" w:hAnsi="Arial"/>
+          <w:b w:val="0"/>
+          <w:i w:val="0"/>
+          <w:color w:val="555555"/>
+          <w:sz w:val="22"/>
+        </w:rPr>
+        <w:t xml:space="preserve">A permanent record of completed fee rounds. Once fees are archived they no longer appear in the Paid tab, keeping it clean for the current season.</w:t>
+      </w:r>
+    </w:p>
+    <w:p>
+      <w:pPr>
+        <w:pStyle w:val="ListBullet"/>
+        <w:spacing w:after="60"/>
+      </w:pPr>
+      <w:r>
+        <w:rPr>
+          <w:rFonts w:ascii="Arial" w:hAnsi="Arial"/>
+          <w:b w:val="0"/>
+          <w:i w:val="0"/>
+          <w:color w:val="555555"/>
+          <w:sz w:val="22"/>
+        </w:rPr>
+        <w:t xml:space="preserve">Click any archived fee name to expand it and see the full list of who paid and how much.</w:t>
+      </w:r>
+    </w:p>
+    <w:p>
+      <w:pPr>
+        <w:pStyle w:val="ListBullet"/>
+        <w:spacing w:after="60"/>
+      </w:pPr>
+      <w:r>
+        <w:rPr>
+          <w:rFonts w:ascii="Arial" w:hAnsi="Arial"/>
+          <w:b w:val="0"/>
+          <w:i w:val="0"/>
+          <w:color w:val="555555"/>
+          <w:sz w:val="22"/>
+        </w:rPr>
+        <w:t xml:space="preserve">Archives cannot be deleted from the website. They are intended as a permanent financial record. If a deletion is ever absolutely necessary, it must be done directly in the Supabase database by someone with technical access.</w:t>
+      </w:r>
+    </w:p>
+    <w:p>
+      <w:pPr>
+        <w:spacing w:before="280" w:after="80"/>
+      </w:pPr>
+      <w:r>
+        <w:rPr>
+          <w:rFonts w:ascii="Arial Narrow" w:hAnsi="Arial Narrow"/>
+          <w:b/>
+          <w:i w:val="0"/>
+          <w:color w:val="1A1A1A"/>
+          <w:sz w:val="26"/>
+        </w:rPr>
+        <w:t xml:space="preserve">Forms tab</w:t>
+      </w:r>
+    </w:p>
+    <w:p>
+      <w:pPr>
+        <w:spacing w:after="120"/>
+      </w:pPr>
+      <w:r>
+        <w:rPr>
+          <w:rFonts w:ascii="Arial" w:hAnsi="Arial"/>
+          <w:b w:val="0"/>
+          <w:i w:val="0"/>
+          <w:color w:val="555555"/>
+          <w:sz w:val="22"/>
+        </w:rPr>
+        <w:t xml:space="preserve">Shows which forms each member has been assigned and whether they have completed them. You can manually mark individual form completions as done or not done — useful if someone completed something offline or outside the normal process.</w:t>
+      </w:r>
+    </w:p>
+    <w:p>
+      <w:pPr>
+        <w:spacing w:before="280" w:after="80"/>
+      </w:pPr>
+      <w:r>
+        <w:rPr>
+          <w:rFonts w:ascii="Arial Narrow" w:hAnsi="Arial Narrow"/>
+          <w:b/>
+          <w:i w:val="0"/>
+          <w:color w:val="1A1A1A"/>
+          <w:sz w:val="26"/>
+        </w:rPr>
+        <w:t xml:space="preserve">Add Member tab</w:t>
+      </w:r>
+    </w:p>
+    <w:p>
+      <w:pPr>
+        <w:spacing w:after="120"/>
+      </w:pPr>
+      <w:r>
+        <w:rPr>
+          <w:rFonts w:ascii="Arial" w:hAnsi="Arial"/>
+          <w:b w:val="0"/>
+          <w:i w:val="0"/>
+          <w:color w:val="555555"/>
+          <w:sz w:val="22"/>
+        </w:rPr>
+        <w:t xml:space="preserve">Create a new member account manually. This is useful when someone needs an account set up for them rather than signing up themselves. Fill in their name, email, student ID, phone number, and year of study. Do not worry about a password — the person will receive a password reset email and set their own password before they can log in. Once the account exists you can assign fees and forms to them immediately from the other tabs.</w:t>
       </w:r>
     </w:p>
     <w:p>
@@ -1121,7 +1864,501 @@
           <w:color w:val="6B1E3E"/>
           <w:sz w:val="36"/>
         </w:rPr>
-        <w:t>5. HANDING OVER TO A NEW PRESIDENT</w:t>
+        <w:t xml:space="preserve">5. ONLINE PAYMENTS — BLINK PAY</w:t>
+      </w:r>
+    </w:p>
+    <w:p>
+      <w:pPr>
+        <w:spacing w:after="120"/>
+      </w:pPr>
+      <w:r>
+        <w:rPr>
+          <w:rFonts w:ascii="Arial" w:hAnsi="Arial"/>
+          <w:b w:val="0"/>
+          <w:i w:val="0"/>
+          <w:color w:val="555555"/>
+          <w:sz w:val="22"/>
+        </w:rPr>
+        <w:t xml:space="preserve">The website is set up to accept online fee payments through a service called Blink Pay. This allows members to pay fees directly on the website using internet banking — no cash or manual bank transfers needed.</w:t>
+      </w:r>
+    </w:p>
+    <w:p>
+      <w:pPr>
+        <w:spacing w:before="280" w:after="80"/>
+      </w:pPr>
+      <w:r>
+        <w:rPr>
+          <w:rFonts w:ascii="Arial Narrow" w:hAnsi="Arial Narrow"/>
+          <w:b/>
+          <w:i w:val="0"/>
+          <w:color w:val="1A1A1A"/>
+          <w:sz w:val="26"/>
+        </w:rPr>
+        <w:t xml:space="preserve">How it works for members</w:t>
+      </w:r>
+    </w:p>
+    <w:p>
+      <w:pPr>
+        <w:pStyle w:val="ListBullet"/>
+        <w:spacing w:after="60"/>
+      </w:pPr>
+      <w:r>
+        <w:rPr>
+          <w:rFonts w:ascii="Arial" w:hAnsi="Arial"/>
+          <w:b w:val="0"/>
+          <w:i w:val="0"/>
+          <w:color w:val="555555"/>
+          <w:sz w:val="22"/>
+        </w:rPr>
+        <w:t xml:space="preserve">The member logs in and clicks Fees in the navigation bar.</w:t>
+      </w:r>
+    </w:p>
+    <w:p>
+      <w:pPr>
+        <w:pStyle w:val="ListBullet"/>
+        <w:spacing w:after="60"/>
+      </w:pPr>
+      <w:r>
+        <w:rPr>
+          <w:rFonts w:ascii="Arial" w:hAnsi="Arial"/>
+          <w:b w:val="0"/>
+          <w:i w:val="0"/>
+          <w:color w:val="555555"/>
+          <w:sz w:val="22"/>
+        </w:rPr>
+        <w:t xml:space="preserve">They see their outstanding fees with a "Pay now — NZ$XX.XX" button next to each one.</w:t>
+      </w:r>
+    </w:p>
+    <w:p>
+      <w:pPr>
+        <w:pStyle w:val="ListBullet"/>
+        <w:spacing w:after="60"/>
+      </w:pPr>
+      <w:r>
+        <w:rPr>
+          <w:rFonts w:ascii="Arial" w:hAnsi="Arial"/>
+          <w:b w:val="0"/>
+          <w:i w:val="0"/>
+          <w:color w:val="555555"/>
+          <w:sz w:val="22"/>
+        </w:rPr>
+        <w:t xml:space="preserve">Clicking "Pay now" takes them to Blink Pay's secure payment page (it looks like a normal banking page).</w:t>
+      </w:r>
+    </w:p>
+    <w:p>
+      <w:pPr>
+        <w:pStyle w:val="ListBullet"/>
+        <w:spacing w:after="60"/>
+      </w:pPr>
+      <w:r>
+        <w:rPr>
+          <w:rFonts w:ascii="Arial" w:hAnsi="Arial"/>
+          <w:b w:val="0"/>
+          <w:i w:val="0"/>
+          <w:color w:val="555555"/>
+          <w:sz w:val="22"/>
+        </w:rPr>
+        <w:t xml:space="preserve">They choose their bank (e.g. ANZ, BNZ, ASB, Westpac), log in to their internet banking as normal, and approve the payment.</w:t>
+      </w:r>
+    </w:p>
+    <w:p>
+      <w:pPr>
+        <w:pStyle w:val="ListBullet"/>
+        <w:spacing w:after="60"/>
+      </w:pPr>
+      <w:r>
+        <w:rPr>
+          <w:rFonts w:ascii="Arial" w:hAnsi="Arial"/>
+          <w:b w:val="0"/>
+          <w:i w:val="0"/>
+          <w:color w:val="555555"/>
+          <w:sz w:val="22"/>
+        </w:rPr>
+        <w:t xml:space="preserve">They are automatically returned to the UCRC website and the fee is marked as paid. No manual action is required from an admin.</w:t>
+      </w:r>
+    </w:p>
+    <w:p>
+      <w:pPr>
+        <w:spacing w:before="280" w:after="80"/>
+      </w:pPr>
+      <w:r>
+        <w:rPr>
+          <w:rFonts w:ascii="Arial Narrow" w:hAnsi="Arial Narrow"/>
+          <w:b/>
+          <w:i w:val="0"/>
+          <w:color w:val="1A1A1A"/>
+          <w:sz w:val="26"/>
+        </w:rPr>
+        <w:t xml:space="preserve">How it works for admins</w:t>
+      </w:r>
+    </w:p>
+    <w:p>
+      <w:pPr>
+        <w:pStyle w:val="ListBullet"/>
+        <w:spacing w:after="60"/>
+      </w:pPr>
+      <w:r>
+        <w:rPr>
+          <w:rFonts w:ascii="Arial" w:hAnsi="Arial"/>
+          <w:b w:val="0"/>
+          <w:i w:val="0"/>
+          <w:color w:val="555555"/>
+          <w:sz w:val="22"/>
+        </w:rPr>
+        <w:t xml:space="preserve">Fees paid online appear in the Paid sub-tab with a "via Blink Pay" label. Everything else works the same as a manually marked payment.</w:t>
+      </w:r>
+    </w:p>
+    <w:p>
+      <w:pPr>
+        <w:pStyle w:val="ListBullet"/>
+        <w:spacing w:after="60"/>
+      </w:pPr>
+      <w:r>
+        <w:rPr>
+          <w:rFonts w:ascii="Arial" w:hAnsi="Arial"/>
+          <w:b w:val="0"/>
+          <w:i w:val="0"/>
+          <w:color w:val="555555"/>
+          <w:sz w:val="22"/>
+        </w:rPr>
+        <w:t xml:space="preserve">You can still mark fees as paid manually at any time (e.g. for cash payments) — Blink Pay is just an additional option, not a requirement.</w:t>
+      </w:r>
+    </w:p>
+    <w:p>
+      <w:pPr>
+        <w:pStyle w:val="ListBullet"/>
+        <w:spacing w:after="60"/>
+      </w:pPr>
+      <w:r>
+        <w:rPr>
+          <w:rFonts w:ascii="Arial" w:hAnsi="Arial"/>
+          <w:b w:val="0"/>
+          <w:i w:val="0"/>
+          <w:color w:val="555555"/>
+          <w:sz w:val="22"/>
+        </w:rPr>
+        <w:t xml:space="preserve">You do not need to log into Blink Pay or take any action when a payment comes through — it is fully automatic.</w:t>
+      </w:r>
+    </w:p>
+    <w:p>
+      <w:pPr>
+        <w:spacing w:before="280" w:after="80"/>
+      </w:pPr>
+      <w:r>
+        <w:rPr>
+          <w:rFonts w:ascii="Arial Narrow" w:hAnsi="Arial Narrow"/>
+          <w:b/>
+          <w:i w:val="0"/>
+          <w:color w:val="1A1A1A"/>
+          <w:sz w:val="26"/>
+        </w:rPr>
+        <w:t xml:space="preserve">Current status — important</w:t>
+      </w:r>
+    </w:p>
+    <w:p>
+      <w:pPr>
+        <w:spacing w:after="120"/>
+      </w:pPr>
+      <w:r>
+        <w:rPr>
+          <w:rFonts w:ascii="Arial" w:hAnsi="Arial"/>
+          <w:b w:val="0"/>
+          <w:i w:val="0"/>
+          <w:color w:val="555555"/>
+          <w:sz w:val="22"/>
+        </w:rPr>
+        <w:t xml:space="preserve">Blink Pay is currently running in test mode (called "sandbox"). This means the payment pages look and function exactly like the real thing, but no actual money is transferred. Before members can use Blink Pay for real payments, the club needs production credentials from Blink Pay.</w:t>
+      </w:r>
+    </w:p>
+    <w:p>
+      <w:pPr>
+        <w:pStyle w:val="ListBullet"/>
+        <w:spacing w:after="60"/>
+      </w:pPr>
+      <w:r>
+        <w:rPr>
+          <w:rFonts w:ascii="Arial" w:hAnsi="Arial"/>
+          <w:b w:val="0"/>
+          <w:i w:val="0"/>
+          <w:color w:val="555555"/>
+          <w:sz w:val="22"/>
+        </w:rPr>
+        <w:t xml:space="preserve">Go to blinkpay.co.nz and register the club as a merchant to receive production API credentials.</w:t>
+      </w:r>
+    </w:p>
+    <w:p>
+      <w:pPr>
+        <w:pStyle w:val="ListBullet"/>
+        <w:spacing w:after="60"/>
+      </w:pPr>
+      <w:r>
+        <w:rPr>
+          <w:rFonts w:ascii="Arial" w:hAnsi="Arial"/>
+          <w:b w:val="0"/>
+          <w:i w:val="0"/>
+          <w:color w:val="555555"/>
+          <w:sz w:val="22"/>
+        </w:rPr>
+        <w:t xml:space="preserve">Pass those credentials to whoever manages the website code (or ask Claude to help). They will need to update two environment variables in Netlify: BLINK_CLIENT_ID and BLINK_CLIENT_SECRET, and change BLINK_ENV from "sandbox" to "production".</w:t>
+      </w:r>
+    </w:p>
+    <w:p>
+      <w:pPr>
+        <w:pStyle w:val="ListBullet"/>
+        <w:spacing w:after="60"/>
+      </w:pPr>
+      <w:r>
+        <w:rPr>
+          <w:rFonts w:ascii="Arial" w:hAnsi="Arial"/>
+          <w:b w:val="0"/>
+          <w:i w:val="0"/>
+          <w:color w:val="555555"/>
+          <w:sz w:val="22"/>
+        </w:rPr>
+        <w:t xml:space="preserve">Until this is done, the "Pay now" buttons on the fees page should not be advertised to members as working. Admins should continue marking fees as paid manually in the meantime.</w:t>
+      </w:r>
+    </w:p>
+    <w:p>
+      <w:pPr>
+        <w:pStyle w:val="ListBullet"/>
+        <w:spacing w:after="60"/>
+      </w:pPr>
+      <w:r>
+        <w:rPr>
+          <w:rFonts w:ascii="Arial" w:hAnsi="Arial"/>
+          <w:b w:val="0"/>
+          <w:i w:val="0"/>
+          <w:color w:val="555555"/>
+          <w:sz w:val="22"/>
+        </w:rPr>
+        <w:t xml:space="preserve">For full technical steps, refer to the README on GitHub.</w:t>
+      </w:r>
+    </w:p>
+    <w:p>
+      <w:pPr>
+        <w:spacing w:before="440" w:after="120"/>
+        <w:pBdr>
+          <w:bottom w:val="single" w:sz="6" w:space="4" w:color="E8A020"/>
+        </w:pBdr>
+      </w:pPr>
+      <w:r>
+        <w:rPr>
+          <w:rFonts w:ascii="Arial Narrow" w:hAnsi="Arial Narrow"/>
+          <w:b/>
+          <w:i w:val="0"/>
+          <w:color w:val="6B1E3E"/>
+          <w:sz w:val="36"/>
+        </w:rPr>
+        <w:t xml:space="preserve">6. START OF SEASON CHECKLIST</w:t>
+      </w:r>
+    </w:p>
+    <w:p>
+      <w:pPr>
+        <w:spacing w:after="120"/>
+      </w:pPr>
+      <w:r>
+        <w:rPr>
+          <w:rFonts w:ascii="Arial" w:hAnsi="Arial"/>
+          <w:b w:val="0"/>
+          <w:i w:val="0"/>
+          <w:color w:val="555555"/>
+          <w:sz w:val="22"/>
+        </w:rPr>
+        <w:t xml:space="preserve">At the start of each new season, work through this list to get the website up to date.</w:t>
+      </w:r>
+    </w:p>
+    <w:p>
+      <w:pPr>
+        <w:pStyle w:val="ListBullet"/>
+        <w:spacing w:after="60"/>
+      </w:pPr>
+      <w:r>
+        <w:rPr>
+          <w:rFonts w:ascii="Arial" w:hAnsi="Arial"/>
+          <w:b w:val="0"/>
+          <w:i w:val="0"/>
+          <w:color w:val="555555"/>
+          <w:sz w:val="22"/>
+        </w:rPr>
+        <w:t xml:space="preserve">Update the exec team on the Contact page — log in, go to Contact, click ✎ Edit page, and update names, roles, and photos for the new committee.</w:t>
+      </w:r>
+    </w:p>
+    <w:p>
+      <w:pPr>
+        <w:pStyle w:val="ListBullet"/>
+        <w:spacing w:after="60"/>
+      </w:pPr>
+      <w:r>
+        <w:rPr>
+          <w:rFonts w:ascii="Arial" w:hAnsi="Arial"/>
+          <w:b w:val="0"/>
+          <w:i w:val="0"/>
+          <w:color w:val="555555"/>
+          <w:sz w:val="22"/>
+        </w:rPr>
+        <w:t xml:space="preserve">Update the year label on the Contact page — search for "2026 Committee" in contact.html and change it to the current year.</w:t>
+      </w:r>
+    </w:p>
+    <w:p>
+      <w:pPr>
+        <w:pStyle w:val="ListBullet"/>
+        <w:spacing w:after="60"/>
+      </w:pPr>
+      <w:r>
+        <w:rPr>
+          <w:rFonts w:ascii="Arial" w:hAnsi="Arial"/>
+          <w:b w:val="0"/>
+          <w:i w:val="0"/>
+          <w:color w:val="555555"/>
+          <w:sz w:val="22"/>
+        </w:rPr>
+        <w:t xml:space="preserve">Update the About page season section — training times, regatta schedule, and social events for the new year.</w:t>
+      </w:r>
+    </w:p>
+    <w:p>
+      <w:pPr>
+        <w:pStyle w:val="ListBullet"/>
+        <w:spacing w:after="60"/>
+      </w:pPr>
+      <w:r>
+        <w:rPr>
+          <w:rFonts w:ascii="Arial" w:hAnsi="Arial"/>
+          <w:b w:val="0"/>
+          <w:i w:val="0"/>
+          <w:color w:val="555555"/>
+          <w:sz w:val="22"/>
+        </w:rPr>
+        <w:t xml:space="preserve">Update membership fee amounts on the About page if they have changed.</w:t>
+      </w:r>
+    </w:p>
+    <w:p>
+      <w:pPr>
+        <w:pStyle w:val="ListBullet"/>
+        <w:spacing w:after="60"/>
+      </w:pPr>
+      <w:r>
+        <w:rPr>
+          <w:rFonts w:ascii="Arial" w:hAnsi="Arial"/>
+          <w:b w:val="0"/>
+          <w:i w:val="0"/>
+          <w:color w:val="555555"/>
+          <w:sz w:val="22"/>
+        </w:rPr>
+        <w:t xml:space="preserve">Create new fee types in the Admin panel for this season's fees (e.g. membership, regatta entries).</w:t>
+      </w:r>
+    </w:p>
+    <w:p>
+      <w:pPr>
+        <w:pStyle w:val="ListBullet"/>
+        <w:spacing w:after="60"/>
+      </w:pPr>
+      <w:r>
+        <w:rPr>
+          <w:rFonts w:ascii="Arial" w:hAnsi="Arial"/>
+          <w:b w:val="0"/>
+          <w:i w:val="0"/>
+          <w:color w:val="555555"/>
+          <w:sz w:val="22"/>
+        </w:rPr>
+        <w:t xml:space="preserve">Assign fees to members using the Assign fee button in the Fees tab.</w:t>
+      </w:r>
+    </w:p>
+    <w:p>
+      <w:pPr>
+        <w:pStyle w:val="ListBullet"/>
+        <w:spacing w:after="60"/>
+      </w:pPr>
+      <w:r>
+        <w:rPr>
+          <w:rFonts w:ascii="Arial" w:hAnsi="Arial"/>
+          <w:b w:val="0"/>
+          <w:i w:val="0"/>
+          <w:color w:val="555555"/>
+          <w:sz w:val="22"/>
+        </w:rPr>
+        <w:t xml:space="preserve">Mark members who have left the club as inactive in the Members tab so they don't appear in fee assignment.</w:t>
+      </w:r>
+    </w:p>
+    <w:p>
+      <w:pPr>
+        <w:pStyle w:val="ListBullet"/>
+        <w:spacing w:after="60"/>
+      </w:pPr>
+      <w:r>
+        <w:rPr>
+          <w:rFonts w:ascii="Arial" w:hAnsi="Arial"/>
+          <w:b w:val="0"/>
+          <w:i w:val="0"/>
+          <w:color w:val="555555"/>
+          <w:sz w:val="22"/>
+        </w:rPr>
+        <w:t xml:space="preserve">Update the Events page with the new season's race calendar.</w:t>
+      </w:r>
+    </w:p>
+    <w:p>
+      <w:pPr>
+        <w:pStyle w:val="ListBullet"/>
+        <w:spacing w:after="60"/>
+      </w:pPr>
+      <w:r>
+        <w:rPr>
+          <w:rFonts w:ascii="Arial" w:hAnsi="Arial"/>
+          <w:b w:val="0"/>
+          <w:i w:val="0"/>
+          <w:color w:val="555555"/>
+          <w:sz w:val="22"/>
+        </w:rPr>
+        <w:t xml:space="preserve">Update the homepage member count stat in index.html if the squad size has changed significantly.</w:t>
+      </w:r>
+    </w:p>
+    <w:p>
+      <w:pPr>
+        <w:pStyle w:val="ListBullet"/>
+        <w:spacing w:after="60"/>
+      </w:pPr>
+      <w:r>
+        <w:rPr>
+          <w:rFonts w:ascii="Arial" w:hAnsi="Arial"/>
+          <w:b w:val="0"/>
+          <w:i w:val="0"/>
+          <w:color w:val="555555"/>
+          <w:sz w:val="22"/>
+        </w:rPr>
+        <w:t xml:space="preserve">Archive last season's completed fee rounds using the Archive tab — this keeps the Paid tab clean for the new season.</w:t>
+      </w:r>
+    </w:p>
+    <w:p>
+      <w:pPr>
+        <w:pStyle w:val="ListBullet"/>
+        <w:spacing w:after="60"/>
+      </w:pPr>
+      <w:r>
+        <w:rPr>
+          <w:rFonts w:ascii="Arial" w:hAnsi="Arial"/>
+          <w:b w:val="0"/>
+          <w:i w:val="0"/>
+          <w:color w:val="555555"/>
+          <w:sz w:val="22"/>
+        </w:rPr>
+        <w:t xml:space="preserve">Renew the domain name if it is due — check Cloudflare (cloudflare.com) logged in with the club email.</w:t>
+      </w:r>
+    </w:p>
+    <w:p>
+      <w:pPr>
+        <w:spacing w:before="440" w:after="120"/>
+        <w:pBdr>
+          <w:bottom w:val="single" w:sz="6" w:space="4" w:color="E8A020"/>
+        </w:pBdr>
+      </w:pPr>
+      <w:r>
+        <w:rPr>
+          <w:rFonts w:ascii="Arial Narrow" w:hAnsi="Arial Narrow"/>
+          <w:b/>
+          <w:i w:val="0"/>
+          <w:color w:val="6B1E3E"/>
+          <w:sz w:val="36"/>
+        </w:rPr>
+        <w:t>7. HANDING OVER TO A NEW PRESIDENT</w:t>
       </w:r>
     </w:p>
     <w:p>
@@ -1336,7 +2573,7 @@
           <w:color w:val="6B1E3E"/>
           <w:sz w:val="36"/>
         </w:rPr>
-        <w:t>6. GETTING HELP AND MAKING CODE CHANGES</w:t>
+        <w:t>8. GETTING HELP AND MAKING CODE CHANGES</w:t>
       </w:r>
     </w:p>
     <w:p>

</xml_diff>